<commit_message>
Phase 0 note: no questionnaire invitation before it is built and validated in Phase 1
Co-Authored-By: Claude Opus 5.5 <noreply@anthropic.com>
Claude-Session: https://claude.ai/code/session_01CPoP9gXznxAoCuDQx1kksH
</commit_message>
<xml_diff>
--- a/cortexskills/deliverables/CortexSkills_Scenario1_Phase0_Reponses_FR.docx
+++ b/cortexskills/deliverables/CortexSkills_Scenario1_Phase0_Reponses_FR.docx
@@ -273,7 +273,7 @@
             </w:rPr>
             <w:fldChar w:fldCharType="separate"/>
           </w:r>
-          <w:hyperlink w:anchor="__RefHeading___Toc639_1905376479">
+          <w:hyperlink w:anchor="__RefHeading___Toc683_4096940391">
             <w:r>
               <w:rPr>
                 <w:rStyle w:val="IndexLink"/>
@@ -293,7 +293,7 @@
             </w:tabs>
             <w:rPr/>
           </w:pPr>
-          <w:hyperlink w:anchor="__RefHeading___Toc641_1905376479">
+          <w:hyperlink w:anchor="__RefHeading___Toc685_4096940391">
             <w:r>
               <w:rPr>
                 <w:rStyle w:val="IndexLink"/>
@@ -313,7 +313,7 @@
             </w:tabs>
             <w:rPr/>
           </w:pPr>
-          <w:hyperlink w:anchor="__RefHeading___Toc643_1905376479">
+          <w:hyperlink w:anchor="__RefHeading___Toc687_4096940391">
             <w:r>
               <w:rPr>
                 <w:rStyle w:val="IndexLink"/>
@@ -333,7 +333,7 @@
             </w:tabs>
             <w:rPr/>
           </w:pPr>
-          <w:hyperlink w:anchor="__RefHeading___Toc645_1905376479">
+          <w:hyperlink w:anchor="__RefHeading___Toc689_4096940391">
             <w:r>
               <w:rPr>
                 <w:rStyle w:val="IndexLink"/>
@@ -353,7 +353,7 @@
             </w:tabs>
             <w:rPr/>
           </w:pPr>
-          <w:hyperlink w:anchor="__RefHeading___Toc647_1905376479">
+          <w:hyperlink w:anchor="__RefHeading___Toc691_4096940391">
             <w:r>
               <w:rPr>
                 <w:rStyle w:val="IndexLink"/>
@@ -373,7 +373,7 @@
             </w:tabs>
             <w:rPr/>
           </w:pPr>
-          <w:hyperlink w:anchor="__RefHeading___Toc649_1905376479">
+          <w:hyperlink w:anchor="__RefHeading___Toc693_4096940391">
             <w:r>
               <w:rPr>
                 <w:rStyle w:val="IndexLink"/>
@@ -393,7 +393,7 @@
             </w:tabs>
             <w:rPr/>
           </w:pPr>
-          <w:hyperlink w:anchor="__RefHeading___Toc651_1905376479">
+          <w:hyperlink w:anchor="__RefHeading___Toc695_4096940391">
             <w:r>
               <w:rPr>
                 <w:rStyle w:val="IndexLink"/>
@@ -413,7 +413,7 @@
             </w:tabs>
             <w:rPr/>
           </w:pPr>
-          <w:hyperlink w:anchor="__RefHeading___Toc653_1905376479">
+          <w:hyperlink w:anchor="__RefHeading___Toc697_4096940391">
             <w:r>
               <w:rPr>
                 <w:rStyle w:val="IndexLink"/>
@@ -433,7 +433,7 @@
             </w:tabs>
             <w:rPr/>
           </w:pPr>
-          <w:hyperlink w:anchor="__RefHeading___Toc655_1905376479">
+          <w:hyperlink w:anchor="__RefHeading___Toc699_4096940391">
             <w:r>
               <w:rPr>
                 <w:rStyle w:val="IndexLink"/>
@@ -453,7 +453,7 @@
             </w:tabs>
             <w:rPr/>
           </w:pPr>
-          <w:hyperlink w:anchor="__RefHeading___Toc657_1905376479">
+          <w:hyperlink w:anchor="__RefHeading___Toc701_4096940391">
             <w:r>
               <w:rPr>
                 <w:rStyle w:val="IndexLink"/>
@@ -473,7 +473,7 @@
             </w:tabs>
             <w:rPr/>
           </w:pPr>
-          <w:hyperlink w:anchor="__RefHeading___Toc659_1905376479">
+          <w:hyperlink w:anchor="__RefHeading___Toc703_4096940391">
             <w:r>
               <w:rPr>
                 <w:rStyle w:val="IndexLink"/>
@@ -493,7 +493,7 @@
             </w:tabs>
             <w:rPr/>
           </w:pPr>
-          <w:hyperlink w:anchor="__RefHeading___Toc661_1905376479">
+          <w:hyperlink w:anchor="__RefHeading___Toc705_4096940391">
             <w:r>
               <w:rPr>
                 <w:rStyle w:val="IndexLink"/>
@@ -513,7 +513,7 @@
             </w:tabs>
             <w:rPr/>
           </w:pPr>
-          <w:hyperlink w:anchor="__RefHeading___Toc663_1905376479">
+          <w:hyperlink w:anchor="__RefHeading___Toc707_4096940391">
             <w:r>
               <w:rPr>
                 <w:rStyle w:val="IndexLink"/>
@@ -533,12 +533,12 @@
             </w:tabs>
             <w:rPr/>
           </w:pPr>
-          <w:hyperlink w:anchor="__RefHeading___Toc665_1905376479">
+          <w:hyperlink w:anchor="__RefHeading___Toc709_4096940391">
             <w:r>
               <w:rPr>
                 <w:rStyle w:val="IndexLink"/>
               </w:rPr>
-              <w:t>7.2 Ce que l’on peut lancer avant la Phase 1</w:t>
+              <w:t>7.2 Ce qui se fait au démarrage, et par quel processus</w:t>
               <w:tab/>
               <w:t>10</w:t>
             </w:r>
@@ -553,14 +553,14 @@
             </w:tabs>
             <w:rPr/>
           </w:pPr>
-          <w:hyperlink w:anchor="__RefHeading___Toc667_1905376479">
+          <w:hyperlink w:anchor="__RefHeading___Toc711_4096940391">
             <w:r>
               <w:rPr>
                 <w:rStyle w:val="IndexLink"/>
               </w:rPr>
               <w:t>8. MP-08.5 — Suivre les indicateurs d’engagement : par rapport à quoi ?</w:t>
               <w:tab/>
-              <w:t>11</w:t>
+              <w:t>12</w:t>
             </w:r>
           </w:hyperlink>
         </w:p>
@@ -573,14 +573,14 @@
             </w:tabs>
             <w:rPr/>
           </w:pPr>
-          <w:hyperlink w:anchor="__RefHeading___Toc669_1905376479">
+          <w:hyperlink w:anchor="__RefHeading___Toc713_4096940391">
             <w:r>
               <w:rPr>
                 <w:rStyle w:val="IndexLink"/>
               </w:rPr>
               <w:t>9. Toutes les tâches de la Phase 0 : quand et pourquoi</w:t>
               <w:tab/>
-              <w:t>12</w:t>
+              <w:t>13</w:t>
             </w:r>
           </w:hyperlink>
         </w:p>
@@ -593,14 +593,14 @@
             </w:tabs>
             <w:rPr/>
           </w:pPr>
-          <w:hyperlink w:anchor="__RefHeading___Toc671_1905376479">
+          <w:hyperlink w:anchor="__RefHeading___Toc715_4096940391">
             <w:r>
               <w:rPr>
                 <w:rStyle w:val="IndexLink"/>
               </w:rPr>
               <w:t>9.1 E2E-15 — Données, IA et intégrations</w:t>
               <w:tab/>
-              <w:t>12</w:t>
+              <w:t>13</w:t>
             </w:r>
           </w:hyperlink>
         </w:p>
@@ -613,14 +613,14 @@
             </w:tabs>
             <w:rPr/>
           </w:pPr>
-          <w:hyperlink w:anchor="__RefHeading___Toc673_1905376479">
+          <w:hyperlink w:anchor="__RefHeading___Toc717_4096940391">
             <w:r>
               <w:rPr>
                 <w:rStyle w:val="IndexLink"/>
               </w:rPr>
               <w:t>9.2 E2E-17 — Du changement à l’adoption</w:t>
               <w:tab/>
-              <w:t>12</w:t>
+              <w:t>13</w:t>
             </w:r>
           </w:hyperlink>
         </w:p>
@@ -633,14 +633,14 @@
             </w:tabs>
             <w:rPr/>
           </w:pPr>
-          <w:hyperlink w:anchor="__RefHeading___Toc675_1905376479">
+          <w:hyperlink w:anchor="__RefHeading___Toc719_4096940391">
             <w:r>
               <w:rPr>
                 <w:rStyle w:val="IndexLink"/>
               </w:rPr>
               <w:t>9.3 E2E-18 — Qualité, risques et amélioration</w:t>
               <w:tab/>
-              <w:t>13</w:t>
+              <w:t>14</w:t>
             </w:r>
           </w:hyperlink>
         </w:p>
@@ -653,14 +653,14 @@
             </w:tabs>
             <w:rPr/>
           </w:pPr>
-          <w:hyperlink w:anchor="__RefHeading___Toc677_1905376479">
+          <w:hyperlink w:anchor="__RefHeading___Toc721_4096940391">
             <w:r>
               <w:rPr>
                 <w:rStyle w:val="IndexLink"/>
               </w:rPr>
               <w:t>10. Corrections proposées</w:t>
               <w:tab/>
-              <w:t>14</w:t>
+              <w:t>15</w:t>
             </w:r>
           </w:hyperlink>
           <w:r>
@@ -697,7 +697,7 @@
         <w:spacing w:before="0" w:after="240"/>
         <w:rPr/>
       </w:pPr>
-      <w:bookmarkStart w:id="0" w:name="__RefHeading___Toc639_1905376479"/>
+      <w:bookmarkStart w:id="0" w:name="__RefHeading___Toc683_4096940391"/>
       <w:bookmarkEnd w:id="0"/>
       <w:r>
         <w:rPr>
@@ -1027,7 +1027,7 @@
                 <w:sz w:val="18"/>
                 <w:szCs w:val="18"/>
               </w:rPr>
-              <w:t>Essentiellement après le jalon G3 (plan approuvé), pendant les Phases 4 à 6. Une version courte peut accompagner le lancement de la mission.</w:t>
+              <w:t>Essentiellement après le jalon G3 (plan approuvé), pendant les Phases 4 à 6. Au lancement, l’accompagnement de la mission relève d’E2E-19 (UFT-19-06), en Phase 1.</w:t>
             </w:r>
           </w:p>
         </w:tc>
@@ -1279,7 +1279,7 @@
         <w:spacing w:before="0" w:after="240"/>
         <w:rPr/>
       </w:pPr>
-      <w:bookmarkStart w:id="1" w:name="__RefHeading___Toc641_1905376479"/>
+      <w:bookmarkStart w:id="1" w:name="__RefHeading___Toc685_4096940391"/>
       <w:bookmarkEnd w:id="1"/>
       <w:r>
         <w:rPr>
@@ -1328,7 +1328,7 @@
         <w:spacing w:before="320" w:after="120"/>
         <w:rPr/>
       </w:pPr>
-      <w:bookmarkStart w:id="2" w:name="__RefHeading___Toc643_1905376479"/>
+      <w:bookmarkStart w:id="2" w:name="__RefHeading___Toc687_4096940391"/>
       <w:bookmarkEnd w:id="2"/>
       <w:r>
         <w:rPr>
@@ -1823,7 +1823,7 @@
         <w:spacing w:before="320" w:after="120"/>
         <w:rPr/>
       </w:pPr>
-      <w:bookmarkStart w:id="3" w:name="__RefHeading___Toc645_1905376479"/>
+      <w:bookmarkStart w:id="3" w:name="__RefHeading___Toc689_4096940391"/>
       <w:bookmarkEnd w:id="3"/>
       <w:r>
         <w:rPr>
@@ -1950,7 +1950,7 @@
       <w:r>
         <w:br w:type="page"/>
       </w:r>
-      <w:bookmarkStart w:id="4" w:name="__RefHeading___Toc647_1905376479"/>
+      <w:bookmarkStart w:id="4" w:name="__RefHeading___Toc691_4096940391"/>
       <w:bookmarkEnd w:id="4"/>
       <w:r>
         <w:rPr>
@@ -1999,7 +1999,7 @@
         <w:spacing w:before="320" w:after="120"/>
         <w:rPr/>
       </w:pPr>
-      <w:bookmarkStart w:id="5" w:name="__RefHeading___Toc649_1905376479"/>
+      <w:bookmarkStart w:id="5" w:name="__RefHeading___Toc693_4096940391"/>
       <w:bookmarkEnd w:id="5"/>
       <w:r>
         <w:rPr>
@@ -2175,7 +2175,7 @@
         <w:spacing w:before="320" w:after="120"/>
         <w:rPr/>
       </w:pPr>
-      <w:bookmarkStart w:id="6" w:name="__RefHeading___Toc651_1905376479"/>
+      <w:bookmarkStart w:id="6" w:name="__RefHeading___Toc695_4096940391"/>
       <w:bookmarkEnd w:id="6"/>
       <w:r>
         <w:rPr>
@@ -2667,7 +2667,7 @@
       <w:r>
         <w:br w:type="page"/>
       </w:r>
-      <w:bookmarkStart w:id="7" w:name="__RefHeading___Toc653_1905376479"/>
+      <w:bookmarkStart w:id="7" w:name="__RefHeading___Toc697_4096940391"/>
       <w:bookmarkEnd w:id="7"/>
       <w:r>
         <w:rPr>
@@ -2716,7 +2716,7 @@
         <w:spacing w:before="320" w:after="120"/>
         <w:rPr/>
       </w:pPr>
-      <w:bookmarkStart w:id="8" w:name="__RefHeading___Toc655_1905376479"/>
+      <w:bookmarkStart w:id="8" w:name="__RefHeading___Toc699_4096940391"/>
       <w:bookmarkEnd w:id="8"/>
       <w:r>
         <w:rPr>
@@ -2989,7 +2989,7 @@
       <w:r>
         <w:br w:type="page"/>
       </w:r>
-      <w:bookmarkStart w:id="9" w:name="__RefHeading___Toc657_1905376479"/>
+      <w:bookmarkStart w:id="9" w:name="__RefHeading___Toc701_4096940391"/>
       <w:bookmarkEnd w:id="9"/>
       <w:r>
         <w:rPr>
@@ -3270,7 +3270,7 @@
                 <w:sz w:val="18"/>
                 <w:szCs w:val="18"/>
               </w:rPr>
-              <w:t>Cycle de lancement (facultatif)</w:t>
+              <w:t>Accompagnement de la mission (hors E2E-17)</w:t>
             </w:r>
           </w:p>
         </w:tc>
@@ -3330,7 +3330,7 @@
                 <w:sz w:val="18"/>
                 <w:szCs w:val="18"/>
               </w:rPr>
-              <w:t>Avant ou pendant la Phase 1.</w:t>
+              <w:t>Phase 1, tâche UFT-19-06 « Planifier l’accompagnement du changement » (processus E2E-19).</w:t>
             </w:r>
           </w:p>
         </w:tc>
@@ -3375,7 +3375,7 @@
         <w:spacing w:before="0" w:after="240"/>
         <w:rPr/>
       </w:pPr>
-      <w:bookmarkStart w:id="10" w:name="__RefHeading___Toc659_1905376479"/>
+      <w:bookmarkStart w:id="10" w:name="__RefHeading___Toc703_4096940391"/>
       <w:bookmarkEnd w:id="10"/>
       <w:r>
         <w:rPr>
@@ -3776,7 +3776,7 @@
           <w:sz w:val="22"/>
           <w:szCs w:val="22"/>
         </w:rPr>
-        <w:t xml:space="preserve">Avant la Phase 1, </w:t>
+        <w:t xml:space="preserve">Au démarrage du projet, </w:t>
       </w:r>
       <w:r>
         <w:rPr>
@@ -3785,7 +3785,7 @@
           <w:sz w:val="22"/>
           <w:szCs w:val="22"/>
         </w:rPr>
-        <w:t>seul un plan court a du sens : annonce de la mission, rôle des relais pour obtenir les réponses aux questionnaires, garanties de confidentialité. Le plan complet ci-dessus se construit après G3.</w:t>
+        <w:t>le plan d’adoption n’a pas d’objet. Ce qui est utile à ce moment (annonce de la mission, relais, garanties de confidentialité) est le plan d’accompagnement de la mission : UFT-19-06, en Phase 1 (« 3 messages du sponsor, réseau de relais, 2 réunions plénières »). Le plan d’adoption ci-dessus se construit après G3.</w:t>
       </w:r>
       <w:r>
         <w:br w:type="page"/>
@@ -3800,7 +3800,7 @@
         <w:spacing w:before="0" w:after="240"/>
         <w:rPr/>
       </w:pPr>
-      <w:bookmarkStart w:id="11" w:name="__RefHeading___Toc661_1905376479"/>
+      <w:bookmarkStart w:id="11" w:name="__RefHeading___Toc705_4096940391"/>
       <w:bookmarkEnd w:id="11"/>
       <w:r>
         <w:rPr>
@@ -3838,7 +3838,7 @@
         <w:spacing w:before="320" w:after="120"/>
         <w:rPr/>
       </w:pPr>
-      <w:bookmarkStart w:id="12" w:name="__RefHeading___Toc663_1905376479"/>
+      <w:bookmarkStart w:id="12" w:name="__RefHeading___Toc707_4096940391"/>
       <w:bookmarkEnd w:id="12"/>
       <w:r>
         <w:rPr>
@@ -3876,7 +3876,7 @@
         <w:spacing w:before="320" w:after="120"/>
         <w:rPr/>
       </w:pPr>
-      <w:bookmarkStart w:id="13" w:name="__RefHeading___Toc665_1905376479"/>
+      <w:bookmarkStart w:id="13" w:name="__RefHeading___Toc709_4096940391"/>
       <w:bookmarkEnd w:id="13"/>
       <w:r>
         <w:rPr>
@@ -3887,7 +3887,24 @@
           <w:sz w:val="32"/>
           <w:szCs w:val="32"/>
         </w:rPr>
-        <w:t>7.2 Ce que l’on peut lancer avant la Phase 1</w:t>
+        <w:t>7.2 Ce qui se fait au démarrage, et par quel processus</w:t>
+      </w:r>
+    </w:p>
+    <w:p>
+      <w:pPr>
+        <w:pStyle w:val="Normal"/>
+        <w:spacing w:lineRule="auto" w:line="288" w:before="0" w:after="160"/>
+        <w:jc w:val="left"/>
+        <w:rPr/>
+      </w:pPr>
+      <w:r>
+        <w:rPr>
+          <w:rFonts w:eastAsia="Open Sans" w:cs="Open Sans"/>
+          <w:color w:val="2C3E50"/>
+          <w:sz w:val="22"/>
+          <w:szCs w:val="22"/>
+        </w:rPr>
+        <w:t>Aucune communication vers les répondants ne se fait avant la Phase 1, et aucune invitation ne part tant que le questionnaire n’est pas élaboré et validé. Tout se passe en Phase 1, dans cet ordre :</w:t>
       </w:r>
     </w:p>
     <w:tbl>
@@ -3904,9 +3921,9 @@
         </w:tblCellMar>
       </w:tblPr>
       <w:tblGrid>
-        <w:gridCol w:w="2198"/>
-        <w:gridCol w:w="3695"/>
-        <w:gridCol w:w="3745"/>
+        <w:gridCol w:w="2397"/>
+        <w:gridCol w:w="4842"/>
+        <w:gridCol w:w="2399"/>
       </w:tblGrid>
       <w:tr>
         <w:trPr>
@@ -3915,7 +3932,7 @@
         </w:trPr>
         <w:tc>
           <w:tcPr>
-            <w:tcW w:w="2198" w:type="dxa"/>
+            <w:tcW w:w="2397" w:type="dxa"/>
             <w:tcBorders>
               <w:top w:val="single" w:sz="4" w:space="0" w:color="E1E8F0"/>
               <w:left w:val="single" w:sz="4" w:space="0" w:color="E1E8F0"/>
@@ -3936,16 +3953,16 @@
                 <w:b/>
                 <w:bCs/>
                 <w:color w:val="FFFFFF"/>
-                <w:sz w:val="18"/>
-                <w:szCs w:val="18"/>
-              </w:rPr>
-              <w:t>Campagne</w:t>
-            </w:r>
-          </w:p>
-        </w:tc>
-        <w:tc>
-          <w:tcPr>
-            <w:tcW w:w="3695" w:type="dxa"/>
+                <w:sz w:val="17"/>
+                <w:szCs w:val="17"/>
+              </w:rPr>
+              <w:t>Moment</w:t>
+            </w:r>
+          </w:p>
+        </w:tc>
+        <w:tc>
+          <w:tcPr>
+            <w:tcW w:w="4842" w:type="dxa"/>
             <w:tcBorders>
               <w:top w:val="single" w:sz="4" w:space="0" w:color="E1E8F0"/>
               <w:left w:val="single" w:sz="4" w:space="0" w:color="E1E8F0"/>
@@ -3966,16 +3983,16 @@
                 <w:b/>
                 <w:bCs/>
                 <w:color w:val="FFFFFF"/>
-                <w:sz w:val="18"/>
-                <w:szCs w:val="18"/>
-              </w:rPr>
-              <w:t>Contenu</w:t>
-            </w:r>
-          </w:p>
-        </w:tc>
-        <w:tc>
-          <w:tcPr>
-            <w:tcW w:w="3745" w:type="dxa"/>
+                <w:sz w:val="17"/>
+                <w:szCs w:val="17"/>
+              </w:rPr>
+              <w:t>Action</w:t>
+            </w:r>
+          </w:p>
+        </w:tc>
+        <w:tc>
+          <w:tcPr>
+            <w:tcW w:w="2399" w:type="dxa"/>
             <w:tcBorders>
               <w:top w:val="single" w:sz="4" w:space="0" w:color="E1E8F0"/>
               <w:left w:val="single" w:sz="4" w:space="0" w:color="E1E8F0"/>
@@ -3996,10 +4013,10 @@
                 <w:b/>
                 <w:bCs/>
                 <w:color w:val="FFFFFF"/>
-                <w:sz w:val="18"/>
-                <w:szCs w:val="18"/>
-              </w:rPr>
-              <w:t>Lien avec la suite</w:t>
+                <w:sz w:val="17"/>
+                <w:szCs w:val="17"/>
+              </w:rPr>
+              <w:t>Processus · tâche</w:t>
             </w:r>
           </w:p>
         </w:tc>
@@ -4010,7 +4027,7 @@
         </w:trPr>
         <w:tc>
           <w:tcPr>
-            <w:tcW w:w="2198" w:type="dxa"/>
+            <w:tcW w:w="2397" w:type="dxa"/>
             <w:tcBorders>
               <w:top w:val="single" w:sz="4" w:space="0" w:color="E1E8F0"/>
               <w:left w:val="single" w:sz="4" w:space="0" w:color="E1E8F0"/>
@@ -4031,16 +4048,16 @@
                 <w:b w:val="false"/>
                 <w:bCs w:val="false"/>
                 <w:color w:val="2C3E50"/>
-                <w:sz w:val="18"/>
-                <w:szCs w:val="18"/>
-              </w:rPr>
-              <w:t>Annonce de la mission</w:t>
-            </w:r>
-          </w:p>
-        </w:tc>
-        <w:tc>
-          <w:tcPr>
-            <w:tcW w:w="3695" w:type="dxa"/>
+                <w:sz w:val="17"/>
+                <w:szCs w:val="17"/>
+              </w:rPr>
+              <w:t>1. Lancement de la mission</w:t>
+            </w:r>
+          </w:p>
+        </w:tc>
+        <w:tc>
+          <w:tcPr>
+            <w:tcW w:w="4842" w:type="dxa"/>
             <w:tcBorders>
               <w:top w:val="single" w:sz="4" w:space="0" w:color="E1E8F0"/>
               <w:left w:val="single" w:sz="4" w:space="0" w:color="E1E8F0"/>
@@ -4061,16 +4078,16 @@
                 <w:b w:val="false"/>
                 <w:bCs w:val="false"/>
                 <w:color w:val="2C3E50"/>
-                <w:sz w:val="18"/>
-                <w:szCs w:val="18"/>
-              </w:rPr>
-              <w:t>Pourquoi le diagnostic, qui est concerné, calendrier, confidentialité des réponses.</w:t>
-            </w:r>
-          </w:p>
-        </w:tc>
-        <w:tc>
-          <w:tcPr>
-            <w:tcW w:w="3745" w:type="dxa"/>
+                <w:sz w:val="17"/>
+                <w:szCs w:val="17"/>
+              </w:rPr>
+              <w:t>Réunion de lancement avec la DRH, le responsable formation et les responsables de fonction : objectifs, calendrier, rôle de chacun.</w:t>
+            </w:r>
+          </w:p>
+        </w:tc>
+        <w:tc>
+          <w:tcPr>
+            <w:tcW w:w="2399" w:type="dxa"/>
             <w:tcBorders>
               <w:top w:val="single" w:sz="4" w:space="0" w:color="E1E8F0"/>
               <w:left w:val="single" w:sz="4" w:space="0" w:color="E1E8F0"/>
@@ -4091,10 +4108,10 @@
                 <w:b w:val="false"/>
                 <w:bCs w:val="false"/>
                 <w:color w:val="2C3E50"/>
-                <w:sz w:val="18"/>
-                <w:szCs w:val="18"/>
-              </w:rPr>
-              <w:t>Prépare la collecte E2E-33 (questionnaires) de la Phase 1.</w:t>
+                <w:sz w:val="17"/>
+                <w:szCs w:val="17"/>
+              </w:rPr>
+              <w:t>E2E-19 · UFT-19-02</w:t>
             </w:r>
           </w:p>
         </w:tc>
@@ -4105,7 +4122,7 @@
         </w:trPr>
         <w:tc>
           <w:tcPr>
-            <w:tcW w:w="2198" w:type="dxa"/>
+            <w:tcW w:w="2397" w:type="dxa"/>
             <w:tcBorders>
               <w:top w:val="single" w:sz="4" w:space="0" w:color="E1E8F0"/>
               <w:left w:val="single" w:sz="4" w:space="0" w:color="E1E8F0"/>
@@ -4126,16 +4143,16 @@
                 <w:b w:val="false"/>
                 <w:bCs w:val="false"/>
                 <w:color w:val="2C3E50"/>
-                <w:sz w:val="18"/>
-                <w:szCs w:val="18"/>
-              </w:rPr>
-              <w:t>Invitation aux questionnaires</w:t>
-            </w:r>
-          </w:p>
-        </w:tc>
-        <w:tc>
-          <w:tcPr>
-            <w:tcW w:w="3695" w:type="dxa"/>
+                <w:sz w:val="17"/>
+                <w:szCs w:val="17"/>
+              </w:rPr>
+              <w:t>2. Accompagnement de la mission</w:t>
+            </w:r>
+          </w:p>
+        </w:tc>
+        <w:tc>
+          <w:tcPr>
+            <w:tcW w:w="4842" w:type="dxa"/>
             <w:tcBorders>
               <w:top w:val="single" w:sz="4" w:space="0" w:color="E1E8F0"/>
               <w:left w:val="single" w:sz="4" w:space="0" w:color="E1E8F0"/>
@@ -4156,16 +4173,16 @@
                 <w:b w:val="false"/>
                 <w:bCs w:val="false"/>
                 <w:color w:val="2C3E50"/>
-                <w:sz w:val="18"/>
-                <w:szCs w:val="18"/>
-              </w:rPr>
-              <w:t>Lien ou QR code, relances par e-mail ou WhatsApp.</w:t>
-            </w:r>
-          </w:p>
-        </w:tc>
-        <w:tc>
-          <w:tcPr>
-            <w:tcW w:w="3745" w:type="dxa"/>
+                <w:sz w:val="17"/>
+                <w:szCs w:val="17"/>
+              </w:rPr>
+              <w:t>Messages du sponsor annonçant le diagnostic, réseau de relais, garanties de confidentialité. Pas encore de lien vers un questionnaire.</w:t>
+            </w:r>
+          </w:p>
+        </w:tc>
+        <w:tc>
+          <w:tcPr>
+            <w:tcW w:w="2399" w:type="dxa"/>
             <w:tcBorders>
               <w:top w:val="single" w:sz="4" w:space="0" w:color="E1E8F0"/>
               <w:left w:val="single" w:sz="4" w:space="0" w:color="E1E8F0"/>
@@ -4186,10 +4203,484 @@
                 <w:b w:val="false"/>
                 <w:bCs w:val="false"/>
                 <w:color w:val="2C3E50"/>
-                <w:sz w:val="18"/>
-                <w:szCs w:val="18"/>
-              </w:rPr>
-              <w:t>Gérée dans le module Questionnaires (plan de canaux et relances), pas dans E2E-17.</w:t>
+                <w:sz w:val="17"/>
+                <w:szCs w:val="17"/>
+              </w:rPr>
+              <w:t>E2E-19 · UFT-19-06</w:t>
+            </w:r>
+          </w:p>
+        </w:tc>
+      </w:tr>
+      <w:tr>
+        <w:trPr>
+          <w:cantSplit w:val="true"/>
+        </w:trPr>
+        <w:tc>
+          <w:tcPr>
+            <w:tcW w:w="2397" w:type="dxa"/>
+            <w:tcBorders>
+              <w:top w:val="single" w:sz="4" w:space="0" w:color="E1E8F0"/>
+              <w:left w:val="single" w:sz="4" w:space="0" w:color="E1E8F0"/>
+              <w:bottom w:val="single" w:sz="4" w:space="0" w:color="E1E8F0"/>
+              <w:right w:val="single" w:sz="4" w:space="0" w:color="E1E8F0"/>
+            </w:tcBorders>
+            <w:shd w:color="auto" w:fill="FFFFFF" w:val="clear"/>
+          </w:tcPr>
+          <w:p>
+            <w:pPr>
+              <w:pStyle w:val="Normal"/>
+              <w:spacing w:before="0" w:after="20"/>
+              <w:rPr/>
+            </w:pPr>
+            <w:r>
+              <w:rPr>
+                <w:rFonts w:eastAsia="Open Sans" w:cs="Open Sans"/>
+                <w:b w:val="false"/>
+                <w:bCs w:val="false"/>
+                <w:color w:val="2C3E50"/>
+                <w:sz w:val="17"/>
+                <w:szCs w:val="17"/>
+              </w:rPr>
+              <w:t>3. Périmètre approuvé et publié</w:t>
+            </w:r>
+          </w:p>
+        </w:tc>
+        <w:tc>
+          <w:tcPr>
+            <w:tcW w:w="4842" w:type="dxa"/>
+            <w:tcBorders>
+              <w:top w:val="single" w:sz="4" w:space="0" w:color="E1E8F0"/>
+              <w:left w:val="single" w:sz="4" w:space="0" w:color="E1E8F0"/>
+              <w:bottom w:val="single" w:sz="4" w:space="0" w:color="E1E8F0"/>
+              <w:right w:val="single" w:sz="4" w:space="0" w:color="E1E8F0"/>
+            </w:tcBorders>
+            <w:shd w:color="auto" w:fill="FFFFFF" w:val="clear"/>
+          </w:tcPr>
+          <w:p>
+            <w:pPr>
+              <w:pStyle w:val="Normal"/>
+              <w:spacing w:before="0" w:after="20"/>
+              <w:rPr/>
+            </w:pPr>
+            <w:r>
+              <w:rPr>
+                <w:rFonts w:eastAsia="Open Sans" w:cs="Open Sans"/>
+                <w:b w:val="false"/>
+                <w:bCs w:val="false"/>
+                <w:color w:val="2C3E50"/>
+                <w:sz w:val="17"/>
+                <w:szCs w:val="17"/>
+              </w:rPr>
+              <w:t>Fonctions, niveaux de décision et parties prenantes (les futurs répondants) validés puis transmis au studio questionnaires.</w:t>
+            </w:r>
+          </w:p>
+        </w:tc>
+        <w:tc>
+          <w:tcPr>
+            <w:tcW w:w="2399" w:type="dxa"/>
+            <w:tcBorders>
+              <w:top w:val="single" w:sz="4" w:space="0" w:color="E1E8F0"/>
+              <w:left w:val="single" w:sz="4" w:space="0" w:color="E1E8F0"/>
+              <w:bottom w:val="single" w:sz="4" w:space="0" w:color="E1E8F0"/>
+              <w:right w:val="single" w:sz="4" w:space="0" w:color="E1E8F0"/>
+            </w:tcBorders>
+            <w:shd w:color="auto" w:fill="FFFFFF" w:val="clear"/>
+          </w:tcPr>
+          <w:p>
+            <w:pPr>
+              <w:pStyle w:val="Normal"/>
+              <w:spacing w:before="0" w:after="20"/>
+              <w:rPr/>
+            </w:pPr>
+            <w:r>
+              <w:rPr>
+                <w:rFonts w:eastAsia="Open Sans" w:cs="Open Sans"/>
+                <w:b w:val="false"/>
+                <w:bCs w:val="false"/>
+                <w:color w:val="2C3E50"/>
+                <w:sz w:val="17"/>
+                <w:szCs w:val="17"/>
+              </w:rPr>
+              <w:t>E2E-32 · UFT-32-07 à 32-09</w:t>
+            </w:r>
+          </w:p>
+        </w:tc>
+      </w:tr>
+      <w:tr>
+        <w:trPr>
+          <w:cantSplit w:val="true"/>
+        </w:trPr>
+        <w:tc>
+          <w:tcPr>
+            <w:tcW w:w="2397" w:type="dxa"/>
+            <w:tcBorders>
+              <w:top w:val="single" w:sz="4" w:space="0" w:color="E1E8F0"/>
+              <w:left w:val="single" w:sz="4" w:space="0" w:color="E1E8F0"/>
+              <w:bottom w:val="single" w:sz="4" w:space="0" w:color="E1E8F0"/>
+              <w:right w:val="single" w:sz="4" w:space="0" w:color="E1E8F0"/>
+            </w:tcBorders>
+            <w:shd w:color="auto" w:fill="F5F8FB" w:val="clear"/>
+          </w:tcPr>
+          <w:p>
+            <w:pPr>
+              <w:pStyle w:val="Normal"/>
+              <w:spacing w:before="0" w:after="20"/>
+              <w:rPr/>
+            </w:pPr>
+            <w:r>
+              <w:rPr>
+                <w:rFonts w:eastAsia="Open Sans" w:cs="Open Sans"/>
+                <w:b w:val="false"/>
+                <w:bCs w:val="false"/>
+                <w:color w:val="2C3E50"/>
+                <w:sz w:val="17"/>
+                <w:szCs w:val="17"/>
+              </w:rPr>
+              <w:t>4. Questionnaire élaboré et validé</w:t>
+            </w:r>
+          </w:p>
+        </w:tc>
+        <w:tc>
+          <w:tcPr>
+            <w:tcW w:w="4842" w:type="dxa"/>
+            <w:tcBorders>
+              <w:top w:val="single" w:sz="4" w:space="0" w:color="E1E8F0"/>
+              <w:left w:val="single" w:sz="4" w:space="0" w:color="E1E8F0"/>
+              <w:bottom w:val="single" w:sz="4" w:space="0" w:color="E1E8F0"/>
+              <w:right w:val="single" w:sz="4" w:space="0" w:color="E1E8F0"/>
+            </w:tcBorders>
+            <w:shd w:color="auto" w:fill="F5F8FB" w:val="clear"/>
+          </w:tcPr>
+          <w:p>
+            <w:pPr>
+              <w:pStyle w:val="Normal"/>
+              <w:spacing w:before="0" w:after="20"/>
+              <w:rPr/>
+            </w:pPr>
+            <w:r>
+              <w:rPr>
+                <w:rFonts w:eastAsia="Open Sans" w:cs="Open Sans"/>
+                <w:b w:val="false"/>
+                <w:bCs w:val="false"/>
+                <w:color w:val="2C3E50"/>
+                <w:sz w:val="17"/>
+                <w:szCs w:val="17"/>
+              </w:rPr>
+              <w:t>Choix du modèle, élaboration (24 questions), adaptation et validation de chaque question, RACSI.</w:t>
+            </w:r>
+          </w:p>
+        </w:tc>
+        <w:tc>
+          <w:tcPr>
+            <w:tcW w:w="2399" w:type="dxa"/>
+            <w:tcBorders>
+              <w:top w:val="single" w:sz="4" w:space="0" w:color="E1E8F0"/>
+              <w:left w:val="single" w:sz="4" w:space="0" w:color="E1E8F0"/>
+              <w:bottom w:val="single" w:sz="4" w:space="0" w:color="E1E8F0"/>
+              <w:right w:val="single" w:sz="4" w:space="0" w:color="E1E8F0"/>
+            </w:tcBorders>
+            <w:shd w:color="auto" w:fill="F5F8FB" w:val="clear"/>
+          </w:tcPr>
+          <w:p>
+            <w:pPr>
+              <w:pStyle w:val="Normal"/>
+              <w:spacing w:before="0" w:after="20"/>
+              <w:rPr/>
+            </w:pPr>
+            <w:r>
+              <w:rPr>
+                <w:rFonts w:eastAsia="Open Sans" w:cs="Open Sans"/>
+                <w:b w:val="false"/>
+                <w:bCs w:val="false"/>
+                <w:color w:val="2C3E50"/>
+                <w:sz w:val="17"/>
+                <w:szCs w:val="17"/>
+              </w:rPr>
+              <w:t>E2E-33 · UFT-33-01 à 33-04</w:t>
+            </w:r>
+          </w:p>
+        </w:tc>
+      </w:tr>
+      <w:tr>
+        <w:trPr>
+          <w:cantSplit w:val="true"/>
+        </w:trPr>
+        <w:tc>
+          <w:tcPr>
+            <w:tcW w:w="2397" w:type="dxa"/>
+            <w:tcBorders>
+              <w:top w:val="single" w:sz="4" w:space="0" w:color="E1E8F0"/>
+              <w:left w:val="single" w:sz="4" w:space="0" w:color="E1E8F0"/>
+              <w:bottom w:val="single" w:sz="4" w:space="0" w:color="E1E8F0"/>
+              <w:right w:val="single" w:sz="4" w:space="0" w:color="E1E8F0"/>
+            </w:tcBorders>
+            <w:shd w:color="auto" w:fill="FFFFFF" w:val="clear"/>
+          </w:tcPr>
+          <w:p>
+            <w:pPr>
+              <w:pStyle w:val="Normal"/>
+              <w:spacing w:before="0" w:after="20"/>
+              <w:rPr/>
+            </w:pPr>
+            <w:r>
+              <w:rPr>
+                <w:rFonts w:eastAsia="Open Sans" w:cs="Open Sans"/>
+                <w:b w:val="false"/>
+                <w:bCs w:val="false"/>
+                <w:color w:val="2C3E50"/>
+                <w:sz w:val="17"/>
+                <w:szCs w:val="17"/>
+              </w:rPr>
+              <w:t>5. Canaux choisis</w:t>
+            </w:r>
+          </w:p>
+        </w:tc>
+        <w:tc>
+          <w:tcPr>
+            <w:tcW w:w="4842" w:type="dxa"/>
+            <w:tcBorders>
+              <w:top w:val="single" w:sz="4" w:space="0" w:color="E1E8F0"/>
+              <w:left w:val="single" w:sz="4" w:space="0" w:color="E1E8F0"/>
+              <w:bottom w:val="single" w:sz="4" w:space="0" w:color="E1E8F0"/>
+              <w:right w:val="single" w:sz="4" w:space="0" w:color="E1E8F0"/>
+            </w:tcBorders>
+            <w:shd w:color="auto" w:fill="FFFFFF" w:val="clear"/>
+          </w:tcPr>
+          <w:p>
+            <w:pPr>
+              <w:pStyle w:val="Normal"/>
+              <w:spacing w:before="0" w:after="20"/>
+              <w:rPr/>
+            </w:pPr>
+            <w:r>
+              <w:rPr>
+                <w:rFonts w:eastAsia="Open Sans" w:cs="Open Sans"/>
+                <w:b w:val="false"/>
+                <w:bCs w:val="false"/>
+                <w:color w:val="2C3E50"/>
+                <w:sz w:val="17"/>
+                <w:szCs w:val="17"/>
+              </w:rPr>
+              <w:t>E-mail pour MS et MO, présentiel sur tablette pour OP, hybride pour l’équipe de nuit.</w:t>
+            </w:r>
+          </w:p>
+        </w:tc>
+        <w:tc>
+          <w:tcPr>
+            <w:tcW w:w="2399" w:type="dxa"/>
+            <w:tcBorders>
+              <w:top w:val="single" w:sz="4" w:space="0" w:color="E1E8F0"/>
+              <w:left w:val="single" w:sz="4" w:space="0" w:color="E1E8F0"/>
+              <w:bottom w:val="single" w:sz="4" w:space="0" w:color="E1E8F0"/>
+              <w:right w:val="single" w:sz="4" w:space="0" w:color="E1E8F0"/>
+            </w:tcBorders>
+            <w:shd w:color="auto" w:fill="FFFFFF" w:val="clear"/>
+          </w:tcPr>
+          <w:p>
+            <w:pPr>
+              <w:pStyle w:val="Normal"/>
+              <w:spacing w:before="0" w:after="20"/>
+              <w:rPr/>
+            </w:pPr>
+            <w:r>
+              <w:rPr>
+                <w:rFonts w:eastAsia="Open Sans" w:cs="Open Sans"/>
+                <w:b w:val="false"/>
+                <w:bCs w:val="false"/>
+                <w:color w:val="2C3E50"/>
+                <w:sz w:val="17"/>
+                <w:szCs w:val="17"/>
+              </w:rPr>
+              <w:t>E2E-33 · UFT-33-05</w:t>
+            </w:r>
+          </w:p>
+        </w:tc>
+      </w:tr>
+      <w:tr>
+        <w:trPr>
+          <w:cantSplit w:val="true"/>
+        </w:trPr>
+        <w:tc>
+          <w:tcPr>
+            <w:tcW w:w="2397" w:type="dxa"/>
+            <w:tcBorders>
+              <w:top w:val="single" w:sz="4" w:space="0" w:color="E1E8F0"/>
+              <w:left w:val="single" w:sz="4" w:space="0" w:color="E1E8F0"/>
+              <w:bottom w:val="single" w:sz="4" w:space="0" w:color="E1E8F0"/>
+              <w:right w:val="single" w:sz="4" w:space="0" w:color="E1E8F0"/>
+            </w:tcBorders>
+            <w:shd w:color="auto" w:fill="F5F8FB" w:val="clear"/>
+          </w:tcPr>
+          <w:p>
+            <w:pPr>
+              <w:pStyle w:val="Normal"/>
+              <w:spacing w:before="0" w:after="20"/>
+              <w:rPr/>
+            </w:pPr>
+            <w:r>
+              <w:rPr>
+                <w:rFonts w:eastAsia="Open Sans" w:cs="Open Sans"/>
+                <w:b w:val="false"/>
+                <w:bCs w:val="false"/>
+                <w:color w:val="2C3E50"/>
+                <w:sz w:val="17"/>
+                <w:szCs w:val="17"/>
+              </w:rPr>
+              <w:t>6. Invitation et relances</w:t>
+            </w:r>
+          </w:p>
+        </w:tc>
+        <w:tc>
+          <w:tcPr>
+            <w:tcW w:w="4842" w:type="dxa"/>
+            <w:tcBorders>
+              <w:top w:val="single" w:sz="4" w:space="0" w:color="E1E8F0"/>
+              <w:left w:val="single" w:sz="4" w:space="0" w:color="E1E8F0"/>
+              <w:bottom w:val="single" w:sz="4" w:space="0" w:color="E1E8F0"/>
+              <w:right w:val="single" w:sz="4" w:space="0" w:color="E1E8F0"/>
+            </w:tcBorders>
+            <w:shd w:color="auto" w:fill="F5F8FB" w:val="clear"/>
+          </w:tcPr>
+          <w:p>
+            <w:pPr>
+              <w:pStyle w:val="Normal"/>
+              <w:spacing w:before="0" w:after="20"/>
+              <w:rPr/>
+            </w:pPr>
+            <w:r>
+              <w:rPr>
+                <w:rFonts w:eastAsia="Open Sans" w:cs="Open Sans"/>
+                <w:b w:val="false"/>
+                <w:bCs w:val="false"/>
+                <w:color w:val="2C3E50"/>
+                <w:sz w:val="17"/>
+                <w:szCs w:val="17"/>
+              </w:rPr>
+              <w:t>Diffusion du questionnaire validé aux parties prenantes, puis relances à J5 et J10 par e-mail ou WhatsApp.</w:t>
+            </w:r>
+          </w:p>
+        </w:tc>
+        <w:tc>
+          <w:tcPr>
+            <w:tcW w:w="2399" w:type="dxa"/>
+            <w:tcBorders>
+              <w:top w:val="single" w:sz="4" w:space="0" w:color="E1E8F0"/>
+              <w:left w:val="single" w:sz="4" w:space="0" w:color="E1E8F0"/>
+              <w:bottom w:val="single" w:sz="4" w:space="0" w:color="E1E8F0"/>
+              <w:right w:val="single" w:sz="4" w:space="0" w:color="E1E8F0"/>
+            </w:tcBorders>
+            <w:shd w:color="auto" w:fill="F5F8FB" w:val="clear"/>
+          </w:tcPr>
+          <w:p>
+            <w:pPr>
+              <w:pStyle w:val="Normal"/>
+              <w:spacing w:before="0" w:after="20"/>
+              <w:rPr/>
+            </w:pPr>
+            <w:r>
+              <w:rPr>
+                <w:rFonts w:eastAsia="Open Sans" w:cs="Open Sans"/>
+                <w:b w:val="false"/>
+                <w:bCs w:val="false"/>
+                <w:color w:val="2C3E50"/>
+                <w:sz w:val="17"/>
+                <w:szCs w:val="17"/>
+              </w:rPr>
+              <w:t>E2E-33 · UFT-33-06 et 33-07</w:t>
+            </w:r>
+          </w:p>
+        </w:tc>
+      </w:tr>
+    </w:tbl>
+    <w:p>
+      <w:pPr>
+        <w:pStyle w:val="Normal"/>
+        <w:spacing w:before="0" w:after="120"/>
+        <w:rPr/>
+      </w:pPr>
+      <w:r>
+        <w:rPr/>
+      </w:r>
+    </w:p>
+    <w:tbl>
+      <w:tblPr>
+        <w:tblW w:w="9638" w:type="dxa"/>
+        <w:jc w:val="left"/>
+        <w:tblInd w:w="0" w:type="dxa"/>
+        <w:tblLayout w:type="fixed"/>
+        <w:tblCellMar>
+          <w:top w:w="160" w:type="dxa"/>
+          <w:left w:w="220" w:type="dxa"/>
+          <w:bottom w:w="160" w:type="dxa"/>
+          <w:right w:w="220" w:type="dxa"/>
+        </w:tblCellMar>
+      </w:tblPr>
+      <w:tblGrid>
+        <w:gridCol w:w="9638"/>
+      </w:tblGrid>
+      <w:tr>
+        <w:trPr/>
+        <w:tc>
+          <w:tcPr>
+            <w:tcW w:w="9638" w:type="dxa"/>
+            <w:tcBorders>
+              <w:top w:val="single" w:sz="4" w:space="0" w:color="E1E8F0"/>
+              <w:left w:val="single" w:sz="4" w:space="0" w:color="E1E8F0"/>
+              <w:bottom w:val="single" w:sz="4" w:space="0" w:color="E1E8F0"/>
+              <w:right w:val="single" w:sz="4" w:space="0" w:color="E1E8F0"/>
+            </w:tcBorders>
+            <w:shd w:color="auto" w:fill="F5F8FB" w:val="clear"/>
+          </w:tcPr>
+          <w:p>
+            <w:pPr>
+              <w:pStyle w:val="Normal"/>
+              <w:spacing w:before="0" w:after="80"/>
+              <w:rPr/>
+            </w:pPr>
+            <w:r>
+              <w:rPr>
+                <w:rFonts w:eastAsia="Montserrat" w:cs="Montserrat" w:ascii="Montserrat" w:hAnsi="Montserrat"/>
+                <w:b/>
+                <w:bCs/>
+                <w:color w:val="123A5F"/>
+                <w:sz w:val="22"/>
+                <w:szCs w:val="22"/>
+              </w:rPr>
+              <w:t>À retenir</w:t>
+            </w:r>
+          </w:p>
+          <w:p>
+            <w:pPr>
+              <w:pStyle w:val="Normal"/>
+              <w:spacing w:lineRule="auto" w:line="288" w:before="0" w:after="60"/>
+              <w:jc w:val="left"/>
+              <w:rPr/>
+            </w:pPr>
+            <w:r>
+              <w:rPr>
+                <w:rFonts w:eastAsia="Open Sans" w:cs="Open Sans"/>
+                <w:color w:val="2C3E50"/>
+                <w:sz w:val="21"/>
+                <w:szCs w:val="21"/>
+              </w:rPr>
+              <w:t>L’invitation aux questionnaires est l’étape 6 : elle suppose le périmètre approuvé et le questionnaire validé. Elle est gérée dans le module Questionnaires (plan de canaux et relances), pas dans E2E-17.</w:t>
+            </w:r>
+          </w:p>
+          <w:p>
+            <w:pPr>
+              <w:pStyle w:val="Normal"/>
+              <w:spacing w:lineRule="auto" w:line="288" w:before="0" w:after="60"/>
+              <w:jc w:val="left"/>
+              <w:rPr/>
+            </w:pPr>
+            <w:r>
+              <w:rPr>
+                <w:rFonts w:eastAsia="Open Sans" w:cs="Open Sans"/>
+                <w:color w:val="2C3E50"/>
+                <w:sz w:val="21"/>
+                <w:szCs w:val="21"/>
+              </w:rPr>
+              <w:t>La version précédente de cette note la présentait à tort comme une action possible avant la Phase 1.</w:t>
             </w:r>
           </w:p>
         </w:tc>
@@ -4207,7 +4698,7 @@
       <w:r>
         <w:br w:type="page"/>
       </w:r>
-      <w:bookmarkStart w:id="14" w:name="__RefHeading___Toc667_1905376479"/>
+      <w:bookmarkStart w:id="14" w:name="__RefHeading___Toc711_4096940391"/>
       <w:bookmarkEnd w:id="14"/>
       <w:r>
         <w:rPr>
@@ -4382,7 +4873,7 @@
                 <w:sz w:val="18"/>
                 <w:szCs w:val="18"/>
               </w:rPr>
-              <w:t>Avant ou pendant la Phase 1</w:t>
+              <w:t>Phase 1, après la diffusion (UFT-33-06)</w:t>
             </w:r>
           </w:p>
         </w:tc>
@@ -4412,7 +4903,7 @@
                 <w:sz w:val="18"/>
                 <w:szCs w:val="18"/>
               </w:rPr>
-              <w:t>Engagement dans la mission : taux de réponse aux questionnaires, participation aux entretiens, taux d’ouverture des messages.</w:t>
+              <w:t>Engagement dans la mission : taux de réponse aux questionnaires, participation aux entretiens, taux d’ouverture des messages. Ces indicateurs sont rendus par UFT-33-12.</w:t>
             </w:r>
           </w:p>
         </w:tc>
@@ -4567,7 +5058,7 @@
           <w:sz w:val="22"/>
           <w:szCs w:val="22"/>
         </w:rPr>
-        <w:t>Les valeurs du guide (par exemple KPI-013 « Taux de progression des compétences ») relèvent du second moment. Avant la Phase 1, utilisez les indicateurs de la première ligne ou laissez l’étape ouverte.</w:t>
+        <w:t>Les valeurs du guide (par exemple KPI-013 « Taux de progression des compétences ») relèvent du second moment. Avant la diffusion du questionnaire, il n’y a aucun engagement à mesurer : laissez l’étape ouverte.</w:t>
       </w:r>
       <w:r>
         <w:br w:type="page"/>
@@ -4582,7 +5073,7 @@
         <w:spacing w:before="0" w:after="240"/>
         <w:rPr/>
       </w:pPr>
-      <w:bookmarkStart w:id="15" w:name="__RefHeading___Toc669_1905376479"/>
+      <w:bookmarkStart w:id="15" w:name="__RefHeading___Toc713_4096940391"/>
       <w:bookmarkEnd w:id="15"/>
       <w:r>
         <w:rPr>
@@ -4620,7 +5111,7 @@
         <w:spacing w:before="320" w:after="120"/>
         <w:rPr/>
       </w:pPr>
-      <w:bookmarkStart w:id="16" w:name="__RefHeading___Toc671_1905376479"/>
+      <w:bookmarkStart w:id="16" w:name="__RefHeading___Toc715_4096940391"/>
       <w:bookmarkEnd w:id="16"/>
       <w:r>
         <w:rPr>
@@ -5421,7 +5912,7 @@
         <w:spacing w:before="320" w:after="120"/>
         <w:rPr/>
       </w:pPr>
-      <w:bookmarkStart w:id="17" w:name="__RefHeading___Toc673_1905376479"/>
+      <w:bookmarkStart w:id="17" w:name="__RefHeading___Toc717_4096940391"/>
       <w:bookmarkEnd w:id="17"/>
       <w:r>
         <w:rPr>
@@ -5609,7 +6100,7 @@
                 <w:sz w:val="17"/>
                 <w:szCs w:val="17"/>
               </w:rPr>
-              <w:t>Après G3 (version courte possible au lancement)</w:t>
+              <w:t>Après G3</w:t>
             </w:r>
           </w:p>
         </w:tc>
@@ -6222,7 +6713,7 @@
         <w:spacing w:before="320" w:after="120"/>
         <w:rPr/>
       </w:pPr>
-      <w:bookmarkStart w:id="18" w:name="__RefHeading___Toc675_1905376479"/>
+      <w:bookmarkStart w:id="18" w:name="__RefHeading___Toc719_4096940391"/>
       <w:bookmarkEnd w:id="18"/>
       <w:r>
         <w:rPr>
@@ -7028,7 +7519,7 @@
       <w:r>
         <w:br w:type="page"/>
       </w:r>
-      <w:bookmarkStart w:id="19" w:name="__RefHeading___Toc677_1905376479"/>
+      <w:bookmarkStart w:id="19" w:name="__RefHeading___Toc721_4096940391"/>
       <w:bookmarkEnd w:id="19"/>
       <w:r>
         <w:rPr>
@@ -7311,7 +7802,7 @@
                 <w:sz w:val="17"/>
                 <w:szCs w:val="17"/>
               </w:rPr>
-              <w:t>Ajouter à la Phase 0 la colonne « Quand » du chapitre 9, et des valeurs « cycle de lancement » pour E2E-17 (annonce de la mission, taux de réponse).</w:t>
+              <w:t>Ajouter à la Phase 0 la colonne « Quand » du chapitre 9, et un renvoi vers UFT-19-06 et E2E-33 pour la communication et l’engagement de la Phase 1.</w:t>
             </w:r>
           </w:p>
         </w:tc>
@@ -7742,7 +8233,7 @@
     </w:r>
     <w:r>
       <w:rPr/>
-      <w:t>14</w:t>
+      <w:t>15</w:t>
     </w:r>
     <w:r>
       <w:rPr/>
@@ -7771,7 +8262,7 @@
     </w:r>
     <w:r>
       <w:rPr/>
-      <w:t>14</w:t>
+      <w:t>15</w:t>
     </w:r>
     <w:r>
       <w:rPr/>

</xml_diff>